<commit_message>
fix lab1 and tag_tfidf code that i messed up through git pull
</commit_message>
<xml_diff>
--- a/Thursday Lab/Genre_Retrieval_Report.docx
+++ b/Thursday Lab/Genre_Retrieval_Report.docx
@@ -185,6 +185,7 @@
       </w:pPr>
       <w:r>
         <w:rPr>
+          <w:noProof/>
           <w:sz w:val="22"/>
           <w:szCs w:val="22"/>
         </w:rPr>
@@ -331,7 +332,23 @@
           <w:sz w:val="22"/>
           <w:szCs w:val="22"/>
         </w:rPr>
-        <w:t>Songs were allowed to maintain basic genre tags that did not match their own (e.g., songs in the “rock” genre can have a “blues” tag, but not a “rock” tag).</w:t>
+        <w:t xml:space="preserve">Songs were allowed to maintain basic genre tags that did not match their own </w:t>
+      </w:r>
+      <w:r>
+        <w:rPr>
+          <w:b/>
+          <w:bCs/>
+          <w:sz w:val="22"/>
+          <w:szCs w:val="22"/>
+        </w:rPr>
+        <w:t>(e.g., songs in the “rock” genre can have a “blues” tag, but not a “rock” tag)</w:t>
+      </w:r>
+      <w:r>
+        <w:rPr>
+          <w:sz w:val="22"/>
+          <w:szCs w:val="22"/>
+        </w:rPr>
+        <w:t>.</w:t>
       </w:r>
     </w:p>
     <w:p>
@@ -406,14 +423,7 @@
           <w:sz w:val="22"/>
           <w:szCs w:val="22"/>
         </w:rPr>
-        <w:t xml:space="preserve">I investigated the spread of top_tag sizes to </w:t>
-      </w:r>
-      <w:r>
-        <w:rPr>
-          <w:sz w:val="22"/>
-          <w:szCs w:val="22"/>
-        </w:rPr>
-        <w:t xml:space="preserve">confirm that there were no crazy outliers (all </w:t>
+        <w:t xml:space="preserve">I investigated the spread of </w:t>
       </w:r>
       <w:r>
         <w:rPr>
@@ -429,6 +439,29 @@
           <w:sz w:val="22"/>
           <w:szCs w:val="22"/>
         </w:rPr>
+        <w:t xml:space="preserve"> sizes to </w:t>
+      </w:r>
+      <w:r>
+        <w:rPr>
+          <w:sz w:val="22"/>
+          <w:szCs w:val="22"/>
+        </w:rPr>
+        <w:t xml:space="preserve">confirm that there were no crazy outliers (all </w:t>
+      </w:r>
+      <w:r>
+        <w:rPr>
+          <w:i/>
+          <w:iCs/>
+          <w:sz w:val="22"/>
+          <w:szCs w:val="22"/>
+        </w:rPr>
+        <w:t>top_tag</w:t>
+      </w:r>
+      <w:r>
+        <w:rPr>
+          <w:sz w:val="22"/>
+          <w:szCs w:val="22"/>
+        </w:rPr>
         <w:t xml:space="preserve"> columns had 0-5 tags per song, which was helpful).</w:t>
       </w:r>
       <w:r>
@@ -465,6 +498,240 @@
           <w:szCs w:val="22"/>
         </w:rPr>
         <w:t>, so that I could experiment with tf-idf cosine similarity vs Jaccard similarity holding more importance.</w:t>
+      </w:r>
+    </w:p>
+    <w:p>
+      <w:pPr>
+        <w:rPr>
+          <w:sz w:val="22"/>
+          <w:szCs w:val="22"/>
+        </w:rPr>
+      </w:pPr>
+      <w:r>
+        <w:rPr>
+          <w:sz w:val="22"/>
+          <w:szCs w:val="22"/>
+        </w:rPr>
+        <w:tab/>
+        <w:t>I first test</w:t>
+      </w:r>
+      <w:r>
+        <w:rPr>
+          <w:sz w:val="22"/>
+          <w:szCs w:val="22"/>
+        </w:rPr>
+        <w:t>ed</w:t>
+      </w:r>
+      <w:r>
+        <w:rPr>
+          <w:sz w:val="22"/>
+          <w:szCs w:val="22"/>
+        </w:rPr>
+        <w:t xml:space="preserve"> my </w:t>
+      </w:r>
+      <w:r>
+        <w:rPr>
+          <w:sz w:val="22"/>
+          <w:szCs w:val="22"/>
+        </w:rPr>
+        <w:t>new system as 0.8(tf-idf cosine) and 0.2(tags), and the</w:t>
+      </w:r>
+      <w:r>
+        <w:rPr>
+          <w:sz w:val="22"/>
+          <w:szCs w:val="22"/>
+        </w:rPr>
+        <w:t xml:space="preserve"> precision@3 jumped to 3</w:t>
+      </w:r>
+      <w:r>
+        <w:rPr>
+          <w:sz w:val="22"/>
+          <w:szCs w:val="22"/>
+        </w:rPr>
+        <w:t>3</w:t>
+      </w:r>
+      <w:r>
+        <w:rPr>
+          <w:sz w:val="22"/>
+          <w:szCs w:val="22"/>
+        </w:rPr>
+        <w:t>%</w:t>
+      </w:r>
+      <w:r>
+        <w:rPr>
+          <w:sz w:val="22"/>
+          <w:szCs w:val="22"/>
+        </w:rPr>
+        <w:t xml:space="preserve">, already improving on baseline. I then tested different weights before landing on </w:t>
+      </w:r>
+      <w:r>
+        <w:rPr>
+          <w:sz w:val="22"/>
+          <w:szCs w:val="22"/>
+        </w:rPr>
+        <w:t>0.</w:t>
+      </w:r>
+      <w:r>
+        <w:rPr>
+          <w:sz w:val="22"/>
+          <w:szCs w:val="22"/>
+        </w:rPr>
+        <w:t>3</w:t>
+      </w:r>
+      <w:r>
+        <w:rPr>
+          <w:sz w:val="22"/>
+          <w:szCs w:val="22"/>
+        </w:rPr>
+        <w:t>(tf-idf cosine) and 0.</w:t>
+      </w:r>
+      <w:r>
+        <w:rPr>
+          <w:sz w:val="22"/>
+          <w:szCs w:val="22"/>
+        </w:rPr>
+        <w:t>7</w:t>
+      </w:r>
+      <w:r>
+        <w:rPr>
+          <w:sz w:val="22"/>
+          <w:szCs w:val="22"/>
+        </w:rPr>
+        <w:t>(tags)</w:t>
+      </w:r>
+      <w:r>
+        <w:rPr>
+          <w:sz w:val="22"/>
+          <w:szCs w:val="22"/>
+        </w:rPr>
+        <w:t xml:space="preserve"> as the best combination</w:t>
+      </w:r>
+      <w:r>
+        <w:rPr>
+          <w:sz w:val="22"/>
+          <w:szCs w:val="22"/>
+        </w:rPr>
+        <w:t>, which surprised me</w:t>
+      </w:r>
+      <w:r>
+        <w:rPr>
+          <w:sz w:val="22"/>
+          <w:szCs w:val="22"/>
+        </w:rPr>
+        <w:t xml:space="preserve">, as I </w:t>
+      </w:r>
+      <w:r>
+        <w:rPr>
+          <w:sz w:val="22"/>
+          <w:szCs w:val="22"/>
+        </w:rPr>
+        <w:t xml:space="preserve">anticipated that tf-idf cosine similarity might be the most meaningful of the two. </w:t>
+      </w:r>
+    </w:p>
+    <w:p>
+      <w:pPr>
+        <w:rPr>
+          <w:sz w:val="22"/>
+          <w:szCs w:val="22"/>
+        </w:rPr>
+      </w:pPr>
+      <w:r>
+        <w:rPr>
+          <w:sz w:val="22"/>
+          <w:szCs w:val="22"/>
+        </w:rPr>
+        <w:drawing>
+          <wp:inline distT="0" distB="0" distL="0" distR="0" wp14:anchorId="74831FB8" wp14:editId="6564D931">
+            <wp:extent cx="3134162" cy="1924319"/>
+            <wp:effectExtent l="0" t="0" r="0" b="0"/>
+            <wp:docPr id="1178037623" name="Picture 1"/>
+            <wp:cNvGraphicFramePr>
+              <a:graphicFrameLocks xmlns:a="http://schemas.openxmlformats.org/drawingml/2006/main" noChangeAspect="1"/>
+            </wp:cNvGraphicFramePr>
+            <a:graphic xmlns:a="http://schemas.openxmlformats.org/drawingml/2006/main">
+              <a:graphicData uri="http://schemas.openxmlformats.org/drawingml/2006/picture">
+                <pic:pic xmlns:pic="http://schemas.openxmlformats.org/drawingml/2006/picture">
+                  <pic:nvPicPr>
+                    <pic:cNvPr id="1178037623" name=""/>
+                    <pic:cNvPicPr/>
+                  </pic:nvPicPr>
+                  <pic:blipFill>
+                    <a:blip r:embed="rId5"/>
+                    <a:stretch>
+                      <a:fillRect/>
+                    </a:stretch>
+                  </pic:blipFill>
+                  <pic:spPr>
+                    <a:xfrm>
+                      <a:off x="0" y="0"/>
+                      <a:ext cx="3134162" cy="1924319"/>
+                    </a:xfrm>
+                    <a:prstGeom prst="rect">
+                      <a:avLst/>
+                    </a:prstGeom>
+                  </pic:spPr>
+                </pic:pic>
+              </a:graphicData>
+            </a:graphic>
+          </wp:inline>
+        </w:drawing>
+      </w:r>
+    </w:p>
+    <w:p>
+      <w:pPr>
+        <w:rPr>
+          <w:i/>
+          <w:iCs/>
+          <w:sz w:val="22"/>
+          <w:szCs w:val="22"/>
+        </w:rPr>
+      </w:pPr>
+      <w:r>
+        <w:rPr>
+          <w:i/>
+          <w:iCs/>
+          <w:sz w:val="22"/>
+          <w:szCs w:val="22"/>
+        </w:rPr>
+        <w:t xml:space="preserve">Figure 2. </w:t>
+      </w:r>
+      <w:r>
+        <w:rPr>
+          <w:i/>
+          <w:iCs/>
+          <w:sz w:val="22"/>
+          <w:szCs w:val="22"/>
+        </w:rPr>
+        <w:t>Precision@3 results for different weights</w:t>
+      </w:r>
+    </w:p>
+    <w:p>
+      <w:pPr>
+        <w:rPr>
+          <w:sz w:val="22"/>
+          <w:szCs w:val="22"/>
+        </w:rPr>
+      </w:pPr>
+      <w:r>
+        <w:rPr>
+          <w:sz w:val="22"/>
+          <w:szCs w:val="22"/>
+        </w:rPr>
+        <w:t>At my system’s best genre</w:t>
+      </w:r>
+      <w:r>
+        <w:rPr>
+          <w:sz w:val="22"/>
+          <w:szCs w:val="22"/>
+        </w:rPr>
+        <w:t xml:space="preserve">-matching weights (0.3/0.7), over 61% of recommendations </w:t>
+      </w:r>
+      <w:r>
+        <w:rPr>
+          <w:sz w:val="22"/>
+          <w:szCs w:val="22"/>
+        </w:rPr>
+        <w:t xml:space="preserve">were from the matching genre. Since genre is the ground truth for this assignment, </w:t>
       </w:r>
     </w:p>
     <w:p>
@@ -482,13 +749,6 @@
           <w:szCs w:val="22"/>
         </w:rPr>
       </w:pPr>
-      <w:r>
-        <w:rPr>
-          <w:sz w:val="22"/>
-          <w:szCs w:val="22"/>
-        </w:rPr>
-        <w:t>Sharing similar words, and going deeper to look at word patterns and word uniqueness as compared to the corpus is useful, but we’re lacking vibes.</w:t>
-      </w:r>
     </w:p>
     <w:p>
       <w:pPr>
@@ -502,7 +762,42 @@
           <w:sz w:val="22"/>
           <w:szCs w:val="22"/>
         </w:rPr>
-        <w:t>Confirmed that the `top_tag` column had up to five tags for each song, which is helpful because it prevents songs with a lot of tags from skewing results.</w:t>
+        <w:lastRenderedPageBreak/>
+        <w:drawing>
+          <wp:inline distT="0" distB="0" distL="0" distR="0" wp14:anchorId="5DEE6370" wp14:editId="27379F3F">
+            <wp:extent cx="3354438" cy="2933700"/>
+            <wp:effectExtent l="0" t="0" r="0" b="0"/>
+            <wp:docPr id="910156953" name="Picture 1"/>
+            <wp:cNvGraphicFramePr>
+              <a:graphicFrameLocks xmlns:a="http://schemas.openxmlformats.org/drawingml/2006/main" noChangeAspect="1"/>
+            </wp:cNvGraphicFramePr>
+            <a:graphic xmlns:a="http://schemas.openxmlformats.org/drawingml/2006/main">
+              <a:graphicData uri="http://schemas.openxmlformats.org/drawingml/2006/picture">
+                <pic:pic xmlns:pic="http://schemas.openxmlformats.org/drawingml/2006/picture">
+                  <pic:nvPicPr>
+                    <pic:cNvPr id="910156953" name=""/>
+                    <pic:cNvPicPr/>
+                  </pic:nvPicPr>
+                  <pic:blipFill>
+                    <a:blip r:embed="rId6"/>
+                    <a:stretch>
+                      <a:fillRect/>
+                    </a:stretch>
+                  </pic:blipFill>
+                  <pic:spPr>
+                    <a:xfrm>
+                      <a:off x="0" y="0"/>
+                      <a:ext cx="3358247" cy="2937032"/>
+                    </a:xfrm>
+                    <a:prstGeom prst="rect">
+                      <a:avLst/>
+                    </a:prstGeom>
+                  </pic:spPr>
+                </pic:pic>
+              </a:graphicData>
+            </a:graphic>
+          </wp:inline>
+        </w:drawing>
       </w:r>
     </w:p>
     <w:p>
@@ -512,137 +807,30 @@
           <w:szCs w:val="22"/>
         </w:rPr>
       </w:pPr>
-    </w:p>
-    <w:p>
-      <w:pPr>
-        <w:rPr>
-          <w:sz w:val="22"/>
-          <w:szCs w:val="22"/>
-        </w:rPr>
-      </w:pPr>
-    </w:p>
-    <w:p>
-      <w:pPr>
-        <w:rPr>
-          <w:sz w:val="22"/>
-          <w:szCs w:val="22"/>
-        </w:rPr>
-      </w:pPr>
-      <w:r>
-        <w:rPr>
-          <w:sz w:val="22"/>
-          <w:szCs w:val="22"/>
-        </w:rPr>
-        <w:t>To engineer a system, we need a ground truth for success or failure. In practice, we would have experts label a dataset or observe user responses and infer success or failure (success might mean they continue their session and click on one of our recommendations, and failure means their session continues but they search for new songs on their own). In the absence of a ground truth, we can use the song genre.</w:t>
-      </w:r>
-    </w:p>
-    <w:p>
-      <w:pPr>
-        <w:rPr>
-          <w:sz w:val="22"/>
-          <w:szCs w:val="22"/>
-        </w:rPr>
-      </w:pPr>
-    </w:p>
-    <w:p>
-      <w:pPr>
-        <w:rPr>
-          <w:sz w:val="22"/>
-          <w:szCs w:val="22"/>
-        </w:rPr>
-      </w:pPr>
-      <w:r>
-        <w:rPr>
-          <w:sz w:val="22"/>
-          <w:szCs w:val="22"/>
-        </w:rPr>
-        <w:t>So your job is:</w:t>
-      </w:r>
-    </w:p>
-    <w:p>
-      <w:pPr>
-        <w:rPr>
-          <w:sz w:val="22"/>
-          <w:szCs w:val="22"/>
-        </w:rPr>
-      </w:pPr>
-    </w:p>
-    <w:p>
-      <w:pPr>
-        <w:rPr>
-          <w:sz w:val="22"/>
-          <w:szCs w:val="22"/>
-        </w:rPr>
-      </w:pPr>
-      <w:r>
-        <w:rPr>
-          <w:sz w:val="22"/>
-          <w:szCs w:val="22"/>
-        </w:rPr>
-        <w:t xml:space="preserve">1. For every Top-40 query song, remove the query song itself and every song by the same artist before selecting the top three recommendations for raw inner product, cosine similarity, and TF-IDF-based cosine similarity. If a recommendation's genre matches the query song's genre, record a hit (`True`); otherwise record a miss (`False`). Report `hits.mean()`: this is mean </w:t>
-      </w:r>
-      <w:r>
-        <w:rPr>
-          <w:b/>
-          <w:bCs/>
-          <w:sz w:val="22"/>
-          <w:szCs w:val="22"/>
-        </w:rPr>
-        <w:t>**precision@3**</w:t>
-      </w:r>
-      <w:r>
-        <w:rPr>
-          <w:sz w:val="22"/>
-          <w:szCs w:val="22"/>
-        </w:rPr>
-        <w:t>, the share of all recommendation slots that are same-genre hits. Do not hard-code the denominator.</w:t>
-      </w:r>
-    </w:p>
-    <w:p>
-      <w:pPr>
-        <w:rPr>
-          <w:sz w:val="22"/>
-          <w:szCs w:val="22"/>
-        </w:rPr>
-      </w:pPr>
-      <w:r>
-        <w:rPr>
-          <w:sz w:val="22"/>
-          <w:szCs w:val="22"/>
-        </w:rPr>
-        <w:t>2. Using the ideas from step 1, try to engineer a system that outperforms the available baselines. What matters is your explanation for why you designed the system you did, not whether or not it outperforms the baselines.</w:t>
-      </w:r>
-    </w:p>
-    <w:p>
-      <w:pPr>
-        <w:rPr>
-          <w:sz w:val="22"/>
-          <w:szCs w:val="22"/>
-        </w:rPr>
-      </w:pPr>
-      <w:r>
-        <w:rPr>
-          <w:sz w:val="22"/>
-          <w:szCs w:val="22"/>
-        </w:rPr>
-        <w:t>3. Write up your results in a separate text file, as a report on your work as a data engineer. Do the existing options work well, or did you find ways to outperform it?</w:t>
-      </w:r>
-    </w:p>
-    <w:p>
-      <w:pPr>
-        <w:rPr>
-          <w:sz w:val="22"/>
-          <w:szCs w:val="22"/>
-        </w:rPr>
-      </w:pPr>
-    </w:p>
-    <w:p>
-      <w:pPr>
-        <w:rPr>
-          <w:sz w:val="22"/>
-          <w:szCs w:val="22"/>
-        </w:rPr>
-      </w:pPr>
+      <w:r>
+        <w:rPr>
+          <w:sz w:val="22"/>
+          <w:szCs w:val="22"/>
+        </w:rPr>
+        <w:tab/>
+        <w:t xml:space="preserve">There are some limitations to my approach, including lack of context about the </w:t>
+      </w:r>
+      <w:r>
+        <w:rPr>
+          <w:i/>
+          <w:iCs/>
+          <w:sz w:val="22"/>
+          <w:szCs w:val="22"/>
+        </w:rPr>
+        <w:t>top_tags</w:t>
+      </w:r>
+      <w:r>
+        <w:rPr>
+          <w:sz w:val="22"/>
+          <w:szCs w:val="22"/>
+        </w:rPr>
+        <w:t xml:space="preserve"> column, </w:t>
+      </w:r>
     </w:p>
     <w:sectPr>
       <w:pgSz w:w="12240" w:h="15840"/>
@@ -1257,6 +1445,7 @@
   <w:style w:type="character" w:default="1" w:styleId="DefaultParagraphFont">
     <w:name w:val="Default Paragraph Font"/>
     <w:uiPriority w:val="1"/>
+    <w:semiHidden/>
     <w:unhideWhenUsed/>
   </w:style>
   <w:style w:type="table" w:default="1" w:styleId="TableNormal">

</xml_diff>

<commit_message>
Final edits to genre report, final code edits, and creation of genre report pdf
</commit_message>
<xml_diff>
--- a/Thursday Lab/Genre_Retrieval_Report.docx
+++ b/Thursday Lab/Genre_Retrieval_Report.docx
@@ -190,9 +190,9 @@
           <w:szCs w:val="22"/>
         </w:rPr>
         <w:drawing>
-          <wp:inline distT="0" distB="0" distL="0" distR="0" wp14:anchorId="49D7FB27" wp14:editId="1F267DF1">
-            <wp:extent cx="2796540" cy="1663882"/>
-            <wp:effectExtent l="0" t="0" r="0" b="0"/>
+          <wp:inline distT="0" distB="0" distL="0" distR="0" wp14:anchorId="49D7FB27" wp14:editId="069F8B3B">
+            <wp:extent cx="3840480" cy="2285004"/>
+            <wp:effectExtent l="0" t="0" r="7620" b="1270"/>
             <wp:docPr id="1416713170" name="Picture 1"/>
             <wp:cNvGraphicFramePr>
               <a:graphicFrameLocks xmlns:a="http://schemas.openxmlformats.org/drawingml/2006/main" noChangeAspect="1"/>
@@ -213,7 +213,7 @@
                   <pic:spPr>
                     <a:xfrm>
                       <a:off x="0" y="0"/>
-                      <a:ext cx="2799902" cy="1665882"/>
+                      <a:ext cx="3850836" cy="2291166"/>
                     </a:xfrm>
                     <a:prstGeom prst="rect">
                       <a:avLst/>
@@ -341,7 +341,25 @@
           <w:sz w:val="22"/>
           <w:szCs w:val="22"/>
         </w:rPr>
-        <w:t>(e.g., songs in the “rock” genre can have a “blues” tag, but not a “rock” tag)</w:t>
+        <w:t>(e.g., songs in the “rock” genre can have a “blues” tag</w:t>
+      </w:r>
+      <w:r>
+        <w:rPr>
+          <w:b/>
+          <w:bCs/>
+          <w:sz w:val="22"/>
+          <w:szCs w:val="22"/>
+        </w:rPr>
+        <w:t xml:space="preserve"> or a “blues rock” tag</w:t>
+      </w:r>
+      <w:r>
+        <w:rPr>
+          <w:b/>
+          <w:bCs/>
+          <w:sz w:val="22"/>
+          <w:szCs w:val="22"/>
+        </w:rPr>
+        <w:t>, but not a “rock” tag)</w:t>
       </w:r>
       <w:r>
         <w:rPr>
@@ -394,7 +412,15 @@
           <w:sz w:val="22"/>
           <w:szCs w:val="22"/>
         </w:rPr>
-        <w:t xml:space="preserve">column and even helped correct its code to ensure that “r&amp;b/soul” genre tags were properly filtered out. ChatGPT also provided a recommendation to use Jaccard similarity as a measure of comparing how tags overlap between songs (it compares </w:t>
+        <w:t xml:space="preserve">column and even helped correct its code to ensure that “r&amp;b/soul” genre tags were properly filtered out. ChatGPT also provided a recommendation to use Jaccard </w:t>
+      </w:r>
+      <w:r>
+        <w:rPr>
+          <w:sz w:val="22"/>
+          <w:szCs w:val="22"/>
+        </w:rPr>
+        <w:lastRenderedPageBreak/>
+        <w:t xml:space="preserve">similarity as a measure of comparing how tags overlap between songs (it compares </w:t>
       </w:r>
       <w:r>
         <w:rPr>
@@ -408,15 +434,7 @@
           <w:sz w:val="22"/>
           <w:szCs w:val="22"/>
         </w:rPr>
-        <w:t xml:space="preserve">, giving a score between 0-1). I then researched Jaccard similarity on my own to ensure the method made sense, </w:t>
-      </w:r>
-      <w:r>
-        <w:rPr>
-          <w:sz w:val="22"/>
-          <w:szCs w:val="22"/>
-        </w:rPr>
-        <w:lastRenderedPageBreak/>
-        <w:t xml:space="preserve">and </w:t>
+        <w:t xml:space="preserve">, giving a score between 0-1). I then researched Jaccard similarity on my own to ensure the method made sense, and </w:t>
       </w:r>
       <w:r>
         <w:rPr>
@@ -641,10 +659,10 @@
           <w:szCs w:val="22"/>
         </w:rPr>
         <w:drawing>
-          <wp:inline distT="0" distB="0" distL="0" distR="0" wp14:anchorId="74831FB8" wp14:editId="6564D931">
-            <wp:extent cx="3134162" cy="1924319"/>
-            <wp:effectExtent l="0" t="0" r="0" b="0"/>
-            <wp:docPr id="1178037623" name="Picture 1"/>
+          <wp:inline distT="0" distB="0" distL="0" distR="0" wp14:anchorId="2D789122" wp14:editId="0686A9E1">
+            <wp:extent cx="2072640" cy="1645717"/>
+            <wp:effectExtent l="0" t="0" r="3810" b="0"/>
+            <wp:docPr id="2048449926" name="Picture 1"/>
             <wp:cNvGraphicFramePr>
               <a:graphicFrameLocks xmlns:a="http://schemas.openxmlformats.org/drawingml/2006/main" noChangeAspect="1"/>
             </wp:cNvGraphicFramePr>
@@ -652,7 +670,7 @@
               <a:graphicData uri="http://schemas.openxmlformats.org/drawingml/2006/picture">
                 <pic:pic xmlns:pic="http://schemas.openxmlformats.org/drawingml/2006/picture">
                   <pic:nvPicPr>
-                    <pic:cNvPr id="1178037623" name=""/>
+                    <pic:cNvPr id="2048449926" name=""/>
                     <pic:cNvPicPr/>
                   </pic:nvPicPr>
                   <pic:blipFill>
@@ -664,7 +682,7 @@
                   <pic:spPr>
                     <a:xfrm>
                       <a:off x="0" y="0"/>
-                      <a:ext cx="3134162" cy="1924319"/>
+                      <a:ext cx="2084177" cy="1654877"/>
                     </a:xfrm>
                     <a:prstGeom prst="rect">
                       <a:avLst/>
@@ -733,6 +751,197 @@
         </w:rPr>
         <w:t xml:space="preserve">were from the matching genre. Since genre is the ground truth for this assignment, </w:t>
       </w:r>
+      <w:r>
+        <w:rPr>
+          <w:sz w:val="22"/>
+          <w:szCs w:val="22"/>
+        </w:rPr>
+        <w:t xml:space="preserve">I was able to triple the baseline output of tf-idf cosine similarity. </w:t>
+      </w:r>
+      <w:r>
+        <w:rPr>
+          <w:sz w:val="22"/>
+          <w:szCs w:val="22"/>
+        </w:rPr>
+        <w:t xml:space="preserve">I was very skeptical of my results, so I asked Chat-GPT for simple ways to cover my bases, and I was able to confirm that </w:t>
+      </w:r>
+      <w:r>
+        <w:rPr>
+          <w:sz w:val="22"/>
+          <w:szCs w:val="22"/>
+        </w:rPr>
+        <w:t>no song had its same genre tag</w:t>
+      </w:r>
+      <w:r>
+        <w:rPr>
+          <w:sz w:val="22"/>
+          <w:szCs w:val="22"/>
+        </w:rPr>
+        <w:t xml:space="preserve"> and that all code to exclude songs of the same artist w</w:t>
+      </w:r>
+      <w:r>
+        <w:rPr>
+          <w:sz w:val="22"/>
+          <w:szCs w:val="22"/>
+        </w:rPr>
+        <w:t>as</w:t>
+      </w:r>
+      <w:r>
+        <w:rPr>
+          <w:sz w:val="22"/>
+          <w:szCs w:val="22"/>
+        </w:rPr>
+        <w:t xml:space="preserve"> correct. </w:t>
+      </w:r>
+      <w:r>
+        <w:rPr>
+          <w:sz w:val="22"/>
+          <w:szCs w:val="22"/>
+        </w:rPr>
+        <w:t>To reiterate, e</w:t>
+      </w:r>
+      <w:r>
+        <w:rPr>
+          <w:sz w:val="22"/>
+          <w:szCs w:val="22"/>
+        </w:rPr>
+        <w:t xml:space="preserve">ven though I removed </w:t>
+      </w:r>
+      <w:r>
+        <w:rPr>
+          <w:sz w:val="22"/>
+          <w:szCs w:val="22"/>
+        </w:rPr>
+        <w:t xml:space="preserve">exact </w:t>
+      </w:r>
+      <w:r>
+        <w:rPr>
+          <w:sz w:val="22"/>
+          <w:szCs w:val="22"/>
+        </w:rPr>
+        <w:t>genre tag matches from songs</w:t>
+      </w:r>
+      <w:r>
+        <w:rPr>
+          <w:sz w:val="22"/>
+          <w:szCs w:val="22"/>
+        </w:rPr>
+        <w:t xml:space="preserve"> (a song in genre “rock” can’t have the “rock” tag)</w:t>
+      </w:r>
+      <w:r>
+        <w:rPr>
+          <w:sz w:val="22"/>
+          <w:szCs w:val="22"/>
+        </w:rPr>
+        <w:t xml:space="preserve">, I kept tags that </w:t>
+      </w:r>
+      <w:r>
+        <w:rPr>
+          <w:sz w:val="22"/>
+          <w:szCs w:val="22"/>
+        </w:rPr>
+        <w:t>included more stylistic genre names like “blues rock” or “</w:t>
+      </w:r>
+      <w:r>
+        <w:rPr>
+          <w:sz w:val="22"/>
+          <w:szCs w:val="22"/>
+        </w:rPr>
+        <w:t xml:space="preserve">country pop” because </w:t>
+      </w:r>
+      <w:r>
+        <w:rPr>
+          <w:sz w:val="22"/>
+          <w:szCs w:val="22"/>
+        </w:rPr>
+        <w:t xml:space="preserve">two songs </w:t>
+      </w:r>
+      <w:r>
+        <w:rPr>
+          <w:sz w:val="22"/>
+          <w:szCs w:val="22"/>
+        </w:rPr>
+        <w:t xml:space="preserve">sharing these more specific tags would be meaningful without fully pointing to a genre. </w:t>
+      </w:r>
+      <w:r>
+        <w:rPr>
+          <w:sz w:val="22"/>
+          <w:szCs w:val="22"/>
+        </w:rPr>
+        <w:t xml:space="preserve">In fact, because I’ve removed </w:t>
+      </w:r>
+      <w:r>
+        <w:rPr>
+          <w:sz w:val="22"/>
+          <w:szCs w:val="22"/>
+        </w:rPr>
+        <w:t>exact genre-</w:t>
+      </w:r>
+      <w:r>
+        <w:rPr>
+          <w:sz w:val="22"/>
+          <w:szCs w:val="22"/>
+        </w:rPr>
+        <w:t xml:space="preserve">matches, these </w:t>
+      </w:r>
+      <w:r>
+        <w:rPr>
+          <w:sz w:val="22"/>
+          <w:szCs w:val="22"/>
+        </w:rPr>
+        <w:t xml:space="preserve">specific, descriptive terms seem like they would be harder to </w:t>
+      </w:r>
+      <w:r>
+        <w:rPr>
+          <w:sz w:val="22"/>
+          <w:szCs w:val="22"/>
+        </w:rPr>
+        <w:t xml:space="preserve">find exact matches </w:t>
+      </w:r>
+      <w:r>
+        <w:rPr>
+          <w:sz w:val="22"/>
+          <w:szCs w:val="22"/>
+        </w:rPr>
+        <w:t xml:space="preserve">for </w:t>
+      </w:r>
+      <w:r>
+        <w:rPr>
+          <w:sz w:val="22"/>
+          <w:szCs w:val="22"/>
+        </w:rPr>
+        <w:t xml:space="preserve">due to their stylistic </w:t>
+      </w:r>
+      <w:r>
+        <w:rPr>
+          <w:sz w:val="22"/>
+          <w:szCs w:val="22"/>
+        </w:rPr>
+        <w:t>emphasis.</w:t>
+      </w:r>
+      <w:r>
+        <w:rPr>
+          <w:sz w:val="22"/>
+          <w:szCs w:val="22"/>
+        </w:rPr>
+        <w:t xml:space="preserve"> </w:t>
+      </w:r>
+    </w:p>
+    <w:p>
+      <w:pPr>
+        <w:rPr>
+          <w:sz w:val="22"/>
+          <w:szCs w:val="22"/>
+        </w:rPr>
+      </w:pPr>
+      <w:r>
+        <w:rPr>
+          <w:sz w:val="22"/>
+          <w:szCs w:val="22"/>
+        </w:rPr>
+        <w:tab/>
+        <w:t>Here’s a breakdown of genre matches by genre for each similarity measure:</w:t>
+      </w:r>
     </w:p>
     <w:p>
       <w:pPr>
@@ -764,10 +973,10 @@
         </w:rPr>
         <w:lastRenderedPageBreak/>
         <w:drawing>
-          <wp:inline distT="0" distB="0" distL="0" distR="0" wp14:anchorId="5DEE6370" wp14:editId="27379F3F">
-            <wp:extent cx="3354438" cy="2933700"/>
+          <wp:inline distT="0" distB="0" distL="0" distR="0" wp14:anchorId="4A0EBC37" wp14:editId="2F63C761">
+            <wp:extent cx="2689860" cy="2440379"/>
             <wp:effectExtent l="0" t="0" r="0" b="0"/>
-            <wp:docPr id="910156953" name="Picture 1"/>
+            <wp:docPr id="833357900" name="Picture 1"/>
             <wp:cNvGraphicFramePr>
               <a:graphicFrameLocks xmlns:a="http://schemas.openxmlformats.org/drawingml/2006/main" noChangeAspect="1"/>
             </wp:cNvGraphicFramePr>
@@ -775,7 +984,7 @@
               <a:graphicData uri="http://schemas.openxmlformats.org/drawingml/2006/picture">
                 <pic:pic xmlns:pic="http://schemas.openxmlformats.org/drawingml/2006/picture">
                   <pic:nvPicPr>
-                    <pic:cNvPr id="910156953" name=""/>
+                    <pic:cNvPr id="833357900" name=""/>
                     <pic:cNvPicPr/>
                   </pic:nvPicPr>
                   <pic:blipFill>
@@ -787,7 +996,7 @@
                   <pic:spPr>
                     <a:xfrm>
                       <a:off x="0" y="0"/>
-                      <a:ext cx="3358247" cy="2937032"/>
+                      <a:ext cx="2697059" cy="2446910"/>
                     </a:xfrm>
                     <a:prstGeom prst="rect">
                       <a:avLst/>
@@ -799,29 +1008,266 @@
           </wp:inline>
         </w:drawing>
       </w:r>
+      <w:r>
+        <w:rPr>
+          <w:sz w:val="22"/>
+          <w:szCs w:val="22"/>
+        </w:rPr>
+        <w:drawing>
+          <wp:inline distT="0" distB="0" distL="0" distR="0" wp14:anchorId="2352DF06" wp14:editId="56EC3434">
+            <wp:extent cx="2628900" cy="2414661"/>
+            <wp:effectExtent l="0" t="0" r="0" b="5080"/>
+            <wp:docPr id="183454964" name="Picture 1"/>
+            <wp:cNvGraphicFramePr>
+              <a:graphicFrameLocks xmlns:a="http://schemas.openxmlformats.org/drawingml/2006/main" noChangeAspect="1"/>
+            </wp:cNvGraphicFramePr>
+            <a:graphic xmlns:a="http://schemas.openxmlformats.org/drawingml/2006/main">
+              <a:graphicData uri="http://schemas.openxmlformats.org/drawingml/2006/picture">
+                <pic:pic xmlns:pic="http://schemas.openxmlformats.org/drawingml/2006/picture">
+                  <pic:nvPicPr>
+                    <pic:cNvPr id="183454964" name=""/>
+                    <pic:cNvPicPr/>
+                  </pic:nvPicPr>
+                  <pic:blipFill>
+                    <a:blip r:embed="rId7"/>
+                    <a:stretch>
+                      <a:fillRect/>
+                    </a:stretch>
+                  </pic:blipFill>
+                  <pic:spPr>
+                    <a:xfrm>
+                      <a:off x="0" y="0"/>
+                      <a:ext cx="2640681" cy="2425482"/>
+                    </a:xfrm>
+                    <a:prstGeom prst="rect">
+                      <a:avLst/>
+                    </a:prstGeom>
+                  </pic:spPr>
+                </pic:pic>
+              </a:graphicData>
+            </a:graphic>
+          </wp:inline>
+        </w:drawing>
+      </w:r>
     </w:p>
     <w:p>
       <w:pPr>
         <w:rPr>
-          <w:sz w:val="22"/>
-          <w:szCs w:val="22"/>
-        </w:rPr>
-      </w:pPr>
-      <w:r>
-        <w:rPr>
-          <w:sz w:val="22"/>
-          <w:szCs w:val="22"/>
-        </w:rPr>
-        <w:tab/>
-        <w:t xml:space="preserve">There are some limitations to my approach, including lack of context about the </w:t>
-      </w:r>
-      <w:r>
-        <w:rPr>
           <w:i/>
           <w:iCs/>
           <w:sz w:val="22"/>
           <w:szCs w:val="22"/>
         </w:rPr>
+      </w:pPr>
+      <w:r>
+        <w:rPr>
+          <w:i/>
+          <w:iCs/>
+          <w:sz w:val="22"/>
+          <w:szCs w:val="22"/>
+        </w:rPr>
+        <w:t xml:space="preserve">Figure 3. Percentages of </w:t>
+      </w:r>
+      <w:r>
+        <w:rPr>
+          <w:i/>
+          <w:iCs/>
+          <w:sz w:val="22"/>
+          <w:szCs w:val="22"/>
+        </w:rPr>
+        <w:t>giving a same-genre match by genre</w:t>
+      </w:r>
+      <w:r>
+        <w:rPr>
+          <w:i/>
+          <w:iCs/>
+          <w:sz w:val="22"/>
+          <w:szCs w:val="22"/>
+        </w:rPr>
+        <w:t xml:space="preserve"> (for </w:t>
+      </w:r>
+      <w:r>
+        <w:rPr>
+          <w:i/>
+          <w:iCs/>
+          <w:sz w:val="22"/>
+          <w:szCs w:val="22"/>
+        </w:rPr>
+        <w:t>.3 and .7 weights, as well as Jaccard tag baseline)</w:t>
+      </w:r>
+    </w:p>
+    <w:p>
+      <w:pPr>
+        <w:rPr>
+          <w:sz w:val="22"/>
+          <w:szCs w:val="22"/>
+        </w:rPr>
+      </w:pPr>
+      <w:r>
+        <w:rPr>
+          <w:sz w:val="22"/>
+          <w:szCs w:val="22"/>
+        </w:rPr>
+        <w:t xml:space="preserve">As shown above, </w:t>
+      </w:r>
+      <w:r>
+        <w:rPr>
+          <w:sz w:val="22"/>
+          <w:szCs w:val="22"/>
+        </w:rPr>
+        <w:t>the combination tf-idf cosine</w:t>
+      </w:r>
+      <w:r>
+        <w:rPr>
+          <w:sz w:val="22"/>
+          <w:szCs w:val="22"/>
+        </w:rPr>
+        <w:t>(0.3)</w:t>
+      </w:r>
+      <w:r>
+        <w:rPr>
+          <w:sz w:val="22"/>
+          <w:szCs w:val="22"/>
+        </w:rPr>
+        <w:t xml:space="preserve"> and Jaccard</w:t>
+      </w:r>
+      <w:r>
+        <w:rPr>
+          <w:sz w:val="22"/>
+          <w:szCs w:val="22"/>
+        </w:rPr>
+        <w:t>(0.7)</w:t>
+      </w:r>
+      <w:r>
+        <w:rPr>
+          <w:sz w:val="22"/>
+          <w:szCs w:val="22"/>
+        </w:rPr>
+        <w:t xml:space="preserve"> method managed at least 40% </w:t>
+      </w:r>
+      <w:r>
+        <w:rPr>
+          <w:sz w:val="22"/>
+          <w:szCs w:val="22"/>
+        </w:rPr>
+        <w:t xml:space="preserve">for </w:t>
+      </w:r>
+      <w:r>
+        <w:rPr>
+          <w:sz w:val="22"/>
+          <w:szCs w:val="22"/>
+        </w:rPr>
+        <w:t>genre matches</w:t>
+      </w:r>
+      <w:r>
+        <w:rPr>
+          <w:sz w:val="22"/>
+          <w:szCs w:val="22"/>
+        </w:rPr>
+        <w:t>, with hip hop, latin, and metal genres having over 80%</w:t>
+      </w:r>
+      <w:r>
+        <w:rPr>
+          <w:sz w:val="22"/>
+          <w:szCs w:val="22"/>
+        </w:rPr>
+        <w:t xml:space="preserve"> accuracy</w:t>
+      </w:r>
+      <w:r>
+        <w:rPr>
+          <w:sz w:val="22"/>
+          <w:szCs w:val="22"/>
+        </w:rPr>
+        <w:t>. I</w:t>
+      </w:r>
+      <w:r>
+        <w:rPr>
+          <w:sz w:val="22"/>
+          <w:szCs w:val="22"/>
+        </w:rPr>
+        <w:t xml:space="preserve">’ve also attached the Jaccard similarity baseline results, which only </w:t>
+      </w:r>
+      <w:r>
+        <w:rPr>
+          <w:sz w:val="22"/>
+          <w:szCs w:val="22"/>
+        </w:rPr>
+        <w:t>beat</w:t>
+      </w:r>
+      <w:r>
+        <w:rPr>
+          <w:sz w:val="22"/>
+          <w:szCs w:val="22"/>
+        </w:rPr>
+        <w:t xml:space="preserve"> out the joint genre recommendation </w:t>
+      </w:r>
+      <w:r>
+        <w:rPr>
+          <w:sz w:val="22"/>
+          <w:szCs w:val="22"/>
+        </w:rPr>
+        <w:t>method for</w:t>
+      </w:r>
+      <w:r>
+        <w:rPr>
+          <w:sz w:val="22"/>
+          <w:szCs w:val="22"/>
+        </w:rPr>
+        <w:t xml:space="preserve"> the metal genre (</w:t>
+      </w:r>
+      <w:r>
+        <w:rPr>
+          <w:sz w:val="22"/>
+          <w:szCs w:val="22"/>
+        </w:rPr>
+        <w:t xml:space="preserve">0.808 vs. 0.800), but </w:t>
+      </w:r>
+      <w:r>
+        <w:rPr>
+          <w:i/>
+          <w:iCs/>
+          <w:sz w:val="22"/>
+          <w:szCs w:val="22"/>
+        </w:rPr>
+        <w:t>barely</w:t>
+      </w:r>
+      <w:r>
+        <w:rPr>
+          <w:sz w:val="22"/>
+          <w:szCs w:val="22"/>
+        </w:rPr>
+        <w:t xml:space="preserve">. </w:t>
+      </w:r>
+      <w:r>
+        <w:rPr>
+          <w:sz w:val="22"/>
+          <w:szCs w:val="22"/>
+        </w:rPr>
+        <w:t xml:space="preserve"> </w:t>
+      </w:r>
+    </w:p>
+    <w:p>
+      <w:pPr>
+        <w:ind w:firstLine="720"/>
+        <w:rPr>
+          <w:sz w:val="22"/>
+          <w:szCs w:val="22"/>
+        </w:rPr>
+      </w:pPr>
+      <w:r>
+        <w:rPr>
+          <w:sz w:val="22"/>
+          <w:szCs w:val="22"/>
+        </w:rPr>
+        <w:t xml:space="preserve">There are some limitations to my approach, including lack of context about the </w:t>
+      </w:r>
+      <w:r>
+        <w:rPr>
+          <w:i/>
+          <w:iCs/>
+          <w:sz w:val="22"/>
+          <w:szCs w:val="22"/>
+        </w:rPr>
         <w:t>top_tags</w:t>
       </w:r>
       <w:r>
@@ -829,7 +1275,121 @@
           <w:sz w:val="22"/>
           <w:szCs w:val="22"/>
         </w:rPr>
-        <w:t xml:space="preserve"> column, </w:t>
+        <w:t xml:space="preserve"> column</w:t>
+      </w:r>
+      <w:r>
+        <w:rPr>
+          <w:sz w:val="22"/>
+          <w:szCs w:val="22"/>
+        </w:rPr>
+        <w:t xml:space="preserve"> (e.g., Where did these tags come from? How many users contributed?</w:t>
+      </w:r>
+      <w:r>
+        <w:rPr>
+          <w:sz w:val="22"/>
+          <w:szCs w:val="22"/>
+        </w:rPr>
+        <w:t xml:space="preserve"> How were tags narrowed down to five?) and </w:t>
+      </w:r>
+      <w:r>
+        <w:rPr>
+          <w:sz w:val="22"/>
+          <w:szCs w:val="22"/>
+        </w:rPr>
+        <w:t xml:space="preserve">potential nuances lost when standardizing the tag column. This approach is very dependent on the </w:t>
+      </w:r>
+      <w:r>
+        <w:rPr>
+          <w:i/>
+          <w:iCs/>
+          <w:sz w:val="22"/>
+          <w:szCs w:val="22"/>
+        </w:rPr>
+        <w:t>top_tag</w:t>
+      </w:r>
+      <w:r>
+        <w:rPr>
+          <w:sz w:val="22"/>
+          <w:szCs w:val="22"/>
+        </w:rPr>
+        <w:t xml:space="preserve"> column</w:t>
+      </w:r>
+      <w:r>
+        <w:rPr>
+          <w:sz w:val="22"/>
+          <w:szCs w:val="22"/>
+        </w:rPr>
+        <w:t>, so replicating this on a different data set may produce wildly different results</w:t>
+      </w:r>
+      <w:r>
+        <w:rPr>
+          <w:sz w:val="22"/>
+          <w:szCs w:val="22"/>
+        </w:rPr>
+        <w:t xml:space="preserve"> (and some data sets may not have a comparable tag column at all). </w:t>
+      </w:r>
+      <w:r>
+        <w:rPr>
+          <w:sz w:val="22"/>
+          <w:szCs w:val="22"/>
+        </w:rPr>
+        <w:t xml:space="preserve">Additionally, my </w:t>
+      </w:r>
+      <w:r>
+        <w:rPr>
+          <w:sz w:val="22"/>
+          <w:szCs w:val="22"/>
+        </w:rPr>
+        <w:t>investigation into top tags by genre was not the most extensive, so there could be</w:t>
+      </w:r>
+      <w:r>
+        <w:rPr>
+          <w:sz w:val="22"/>
+          <w:szCs w:val="22"/>
+        </w:rPr>
+        <w:t xml:space="preserve"> details there that skewed the results. Nonetheless, using these user-defined tags was interesting to me and </w:t>
+      </w:r>
+      <w:r>
+        <w:rPr>
+          <w:sz w:val="22"/>
+          <w:szCs w:val="22"/>
+        </w:rPr>
+        <w:t xml:space="preserve">proved to be a fairly successful endeavor in providing genre-matching recommendations. </w:t>
+      </w:r>
+      <w:r>
+        <w:rPr>
+          <w:sz w:val="22"/>
+          <w:szCs w:val="22"/>
+        </w:rPr>
+        <w:t>I even wonder if the specificity of some of these tags lends themselves better to a broader question of recommendation</w:t>
+      </w:r>
+      <w:r>
+        <w:rPr>
+          <w:sz w:val="22"/>
+          <w:szCs w:val="22"/>
+        </w:rPr>
+        <w:t xml:space="preserve"> that doesn’t use genre as a baseline. For example, some rock songs and blues songs used the tag “blues rock”, despite technically being labeled as different genres. This suggests that a recommendation system should not only consider genre as the ground truth threshold</w:t>
+      </w:r>
+      <w:r>
+        <w:rPr>
+          <w:sz w:val="22"/>
+          <w:szCs w:val="22"/>
+        </w:rPr>
+        <w:t xml:space="preserve"> because it denies cross-genre similarities and preferences </w:t>
+      </w:r>
+      <w:r>
+        <w:rPr>
+          <w:sz w:val="22"/>
+          <w:szCs w:val="22"/>
+        </w:rPr>
+        <w:t>noted by listeners/users. For the purpose of this assignment, however, I understand the need to establish truth</w:t>
+      </w:r>
+      <w:r>
+        <w:rPr>
+          <w:sz w:val="22"/>
+          <w:szCs w:val="22"/>
+        </w:rPr>
+        <w:t xml:space="preserve"> somewhere.</w:t>
       </w:r>
     </w:p>
     <w:sectPr>
@@ -1445,7 +2005,6 @@
   <w:style w:type="character" w:default="1" w:styleId="DefaultParagraphFont">
     <w:name w:val="Default Paragraph Font"/>
     <w:uiPriority w:val="1"/>
-    <w:semiHidden/>
     <w:unhideWhenUsed/>
   </w:style>
   <w:style w:type="table" w:default="1" w:styleId="TableNormal">

</xml_diff>